<commit_message>
Cap nhat menu hien thi gon va dong bo bao cao Word docx, zip
</commit_message>
<xml_diff>
--- a/24002545_PhanVanThang_Lab3.docx
+++ b/24002545_PhanVanThang_Lab3.docx
@@ -53,7 +53,7 @@
         <w:ind w:left="288"/>
       </w:pPr>
       <w:r>
-        <w:t>- Solution Visual Studio: lab3/IT3212_Labs.sln</w:t>
+        <w:t>- Solution Visual Studio: IT3212_Labs.sln</w:t>
       </w:r>
     </w:p>
     <w:p>
@@ -62,7 +62,7 @@
         <w:ind w:left="288"/>
       </w:pPr>
       <w:r>
-        <w:t>- Project C# Console: lab3/Lab03_OOPAdvanced/Lab03_OOPAdvanced.csproj</w:t>
+        <w:t>- Project C# Console: lab3/Lab03_OOPAdvanced.csproj</w:t>
       </w:r>
     </w:p>
     <w:p>
@@ -89,7 +89,7 @@
         <w:ind w:left="288"/>
       </w:pPr>
       <w:r>
-        <w:t>- Mã nguồn chương trình chính: lab3/Lab03_OOPAdvanced/Program.cs</w:t>
+        <w:t>- Mã nguồn chương trình chính: lab3/Program.cs</w:t>
       </w:r>
     </w:p>
     <w:p>

</xml_diff>